<commit_message>
feat: Rename repo to tusco-paper, add TUSCO example files, and update R2 reviewer response
- Rename repository from documenting_tusco to tusco-paper across all tex files
  and submission copies (Data/Code availability sections)
- Add TUSCO example input data (genome, annotation, input GTF) and complete
  example output (HTML reports, classification, IGV plots) under example/
- Add round 2 reviewer response addressing tutorial fix (PR #588) and
  confirming example files are now included in the repository
- Update bibliography, supplement text, and submission PDFs
- Rebuild all LaTeX PDFs

Co-Authored-By: Claude Opus 4.6 (1M context) <noreply@anthropic.com>
</commit_message>
<xml_diff>
--- a/submission/01_for_upload/Inventory_of_Supporting_Information.docx
+++ b/submission/01_for_upload/Inventory_of_Supporting_Information.docx
@@ -8,14 +8,6 @@
       </w:pPr>
       <w:r>
         <w:t xml:space="preserve">Inventory of Supporting Information</w:t>
-      </w:r>
-    </w:p>
-    <w:p>
-      <w:pPr>
-        <w:pStyle w:val="Subtitle"/>
-      </w:pPr>
-      <w:r>
-        <w:t xml:space="preserve">NCOMMS-25-76870B</w:t>
       </w:r>
     </w:p>
     <w:bookmarkStart w:id="13" w:name="inventory-of-supporting-information"/>
@@ -42,7 +34,7 @@
         <w:t xml:space="preserve"> </w:t>
       </w:r>
       <w:r>
-        <w:t xml:space="preserve">Transcriptome Universal Single-isoform COntrol (TUSCO): a benchmarking framework for transcriptome reconstruction quality</w:t>
+        <w:t xml:space="preserve">TUSCO: benchmarking transcriptome reconstruction with endogenous single-isoform controls</w:t>
       </w:r>
     </w:p>
     <w:p>
@@ -641,6 +633,14 @@
     <w:abstractNumId w:val="990"/>
   </w:num>
 </w:numbering>
+</file>
+
+<file path=word/people.xml><?xml version="1.0" encoding="utf-8"?>
+<w15:people xmlns:w15="http://schemas.microsoft.com/office/word/2012/wordml">
+  <w15:person w15:author="Claude">
+    <w15:presenceInfo w15:providerId="None" w15:userId="Claude"/>
+  </w15:person>
+</w15:people>
 </file>
 
 <file path=word/styles.xml><?xml version="1.0" encoding="utf-8"?>

</xml_diff>